<commit_message>
Changes to be committed: 	modified:   public/template/manuscript_template(APA 7th Edition).docx 	modified:   public/template/manuscript_template(IEEE).docx 	modified:   src/App.tsx 	modified:   src/components/Sidebar.tsx
</commit_message>
<xml_diff>
--- a/public/template/manuscript_template(APA 7th Edition).docx
+++ b/public/template/manuscript_template(APA 7th Edition).docx
@@ -29577,19 +29577,13 @@
                             <w:rPr>
                               <w:rFonts w:ascii="Times New Roman" w:hAnsi="Times New Roman" w:cs="Times New Roman"/>
                             </w:rPr>
-                            <w:t>DEPARTMENT OF COMPUTING AND</w:t>
+                            <w:t xml:space="preserve">DEPARTMENT OF </w:t>
                           </w:r>
                           <w:r>
                             <w:rPr>
                               <w:rFonts w:ascii="Times New Roman" w:hAnsi="Times New Roman" w:cs="Times New Roman"/>
                             </w:rPr>
-                            <w:t xml:space="preserve"> </w:t>
-                          </w:r>
-                          <w:r>
-                            <w:rPr>
-                              <w:rFonts w:ascii="Times New Roman" w:hAnsi="Times New Roman" w:cs="Times New Roman"/>
-                            </w:rPr>
-                            <w:t>INFORMATICS</w:t>
+                            <w:t>___________________________</w:t>
                           </w:r>
                         </w:p>
                         <w:p>
@@ -29658,19 +29652,13 @@
                       <w:rPr>
                         <w:rFonts w:ascii="Times New Roman" w:hAnsi="Times New Roman" w:cs="Times New Roman"/>
                       </w:rPr>
-                      <w:t>DEPARTMENT OF COMPUTING AND</w:t>
+                      <w:t xml:space="preserve">DEPARTMENT OF </w:t>
                     </w:r>
                     <w:r>
                       <w:rPr>
                         <w:rFonts w:ascii="Times New Roman" w:hAnsi="Times New Roman" w:cs="Times New Roman"/>
                       </w:rPr>
-                      <w:t xml:space="preserve"> </w:t>
-                    </w:r>
-                    <w:r>
-                      <w:rPr>
-                        <w:rFonts w:ascii="Times New Roman" w:hAnsi="Times New Roman" w:cs="Times New Roman"/>
-                      </w:rPr>
-                      <w:t>INFORMATICS</w:t>
+                      <w:t>___________________________</w:t>
                     </w:r>
                   </w:p>
                   <w:p>
@@ -30560,19 +30548,13 @@
                             <w:rPr>
                               <w:rFonts w:ascii="Times New Roman" w:hAnsi="Times New Roman" w:cs="Times New Roman"/>
                             </w:rPr>
-                            <w:t>DEPARTMENT OF COMPUTING AND</w:t>
+                            <w:t xml:space="preserve">DEPARTMENT OF </w:t>
                           </w:r>
                           <w:r>
                             <w:rPr>
                               <w:rFonts w:ascii="Times New Roman" w:hAnsi="Times New Roman" w:cs="Times New Roman"/>
                             </w:rPr>
-                            <w:t xml:space="preserve"> </w:t>
-                          </w:r>
-                          <w:r>
-                            <w:rPr>
-                              <w:rFonts w:ascii="Times New Roman" w:hAnsi="Times New Roman" w:cs="Times New Roman"/>
-                            </w:rPr>
-                            <w:t>INFORMATICS</w:t>
+                            <w:t>___________________________</w:t>
                           </w:r>
                         </w:p>
                         <w:p>
@@ -30604,7 +30586,7 @@
                             <w:rPr>
                               <w:rFonts w:ascii="Times New Roman" w:hAnsi="Times New Roman" w:cs="Times New Roman"/>
                             </w:rPr>
-                            <w:t>Information Technology</w:t>
+                            <w:t>__________________</w:t>
                           </w:r>
                         </w:p>
                       </w:txbxContent>
@@ -30626,7 +30608,7 @@
         </mc:Choice>
         <mc:Fallback>
           <w:pict>
-            <v:rect w14:anchorId="15C5575B" id="Rectangle 1388528036" o:spid="_x0000_s1040" style="position:absolute;left:0;text-align:left;margin-left:59.85pt;margin-top:14.55pt;width:313.1pt;height:27.8pt;z-index:251745792;visibility:visible;mso-wrap-style:square;mso-width-percent:0;mso-height-percent:0;mso-wrap-distance-left:9pt;mso-wrap-distance-top:0;mso-wrap-distance-right:9pt;mso-wrap-distance-bottom:0;mso-position-horizontal:absolute;mso-position-horizontal-relative:margin;mso-position-vertical:absolute;mso-position-vertical-relative:text;mso-width-percent:0;mso-height-percent:0;mso-width-relative:margin;mso-height-relative:margin;v-text-anchor:top" o:gfxdata="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" filled="f" stroked="f">
+            <v:rect w14:anchorId="15C5575B" id="Rectangle 1388528036" o:spid="_x0000_s1035" style="position:absolute;left:0;text-align:left;margin-left:59.85pt;margin-top:14.55pt;width:313.1pt;height:27.8pt;z-index:251745792;visibility:visible;mso-wrap-style:square;mso-width-percent:0;mso-height-percent:0;mso-wrap-distance-left:9pt;mso-wrap-distance-top:0;mso-wrap-distance-right:9pt;mso-wrap-distance-bottom:0;mso-position-horizontal:absolute;mso-position-horizontal-relative:margin;mso-position-vertical:absolute;mso-position-vertical-relative:text;mso-width-percent:0;mso-height-percent:0;mso-width-relative:margin;mso-height-relative:margin;v-text-anchor:top" o:gfxdata="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" filled="f" stroked="f">
               <v:textbox inset="0,0,0,0">
                 <w:txbxContent>
                   <w:p>
@@ -30641,19 +30623,13 @@
                       <w:rPr>
                         <w:rFonts w:ascii="Times New Roman" w:hAnsi="Times New Roman" w:cs="Times New Roman"/>
                       </w:rPr>
-                      <w:t>DEPARTMENT OF COMPUTING AND</w:t>
+                      <w:t xml:space="preserve">DEPARTMENT OF </w:t>
                     </w:r>
                     <w:r>
                       <w:rPr>
                         <w:rFonts w:ascii="Times New Roman" w:hAnsi="Times New Roman" w:cs="Times New Roman"/>
                       </w:rPr>
-                      <w:t xml:space="preserve"> </w:t>
-                    </w:r>
-                    <w:r>
-                      <w:rPr>
-                        <w:rFonts w:ascii="Times New Roman" w:hAnsi="Times New Roman" w:cs="Times New Roman"/>
-                      </w:rPr>
-                      <w:t>INFORMATICS</w:t>
+                      <w:t>___________________________</w:t>
                     </w:r>
                   </w:p>
                   <w:p>
@@ -30685,7 +30661,7 @@
                       <w:rPr>
                         <w:rFonts w:ascii="Times New Roman" w:hAnsi="Times New Roman" w:cs="Times New Roman"/>
                       </w:rPr>
-                      <w:t>Information Technology</w:t>
+                      <w:t>__________________</w:t>
                     </w:r>
                   </w:p>
                 </w:txbxContent>

</xml_diff>